<commit_message>
Add AE Enablement Guide document
7-page Word document covering overview, why the Demo Studio was built,
step-by-step usage guide, what customers see, and best practices.

Co-Authored-By: MeshMesh <noreply@meshmesh.io>
</commit_message>
<xml_diff>
--- a/Agentforce_Demo_Studio_AE_Enablement.docx
+++ b/Agentforce_Demo_Studio_AE_Enablement.docx
@@ -152,7 +152,7 @@
         </w:rPr>
         <w:t xml:space="preserve">URL: </w:t>
       </w:r>
-      <w:hyperlink w:history="1" r:id="rIdpsbnlv3xonvp8vo2unztq">
+      <w:hyperlink w:history="1" r:id="rIdlaozncr2_khzgkdbnv8am">
         <w:r>
           <w:rPr>
             <w:rStyle w:val="Hyperlink"/>
@@ -725,7 +725,7 @@
         </w:rPr>
         <w:t xml:space="preserve">The studio lives at </w:t>
       </w:r>
-      <w:hyperlink w:history="1" r:id="rId-hcxax-aj4nba_igiiivk">
+      <w:hyperlink w:history="1" r:id="rIdvgx2xumjtrtz1s-hmcex2">
         <w:r>
           <w:rPr>
             <w:rStyle w:val="Hyperlink"/>
@@ -2624,7 +2624,7 @@
         <w:spacing w:after="80"/>
         <w:jc w:val="center"/>
       </w:pPr>
-      <w:hyperlink w:history="1" r:id="rIdmg5m8yhw5aijrymz2tbjq">
+      <w:hyperlink w:history="1" r:id="rIdzngsing--ampw3uh3hyas">
         <w:r>
           <w:rPr>
             <w:rStyle w:val="Hyperlink"/>

</xml_diff>